<commit_message>
feat(document-generation): implement DOCX contract generation and persistence
- Added a new test for generating DOCX contracts and persisting the generated file, ensuring correct response handling and file metadata.
- Enhanced the document generation workflow to support fetching optional organization signing assets, improving contract rendering capabilities.
- Updated related types and functions to accommodate partial organization files, allowing for more flexible contract generation without mandatory assets.
- Improved error handling and logging for missing signing assets during document generation, enhancing robustness.
</commit_message>
<xml_diff>
--- a/packages/workflows/document-generation/templates/contract.docx
+++ b/packages/workflows/document-generation/templates/contract.docx
@@ -6965,68 +6965,13 @@
               </w:rPr>
             </w:pPr>
             <w:r>
-              <w:rPr>
-                <w:rFonts w:asciiTheme="majorBidi" w:eastAsiaTheme="minorHAnsi" w:hAnsiTheme="majorBidi" w:cstheme="majorBidi"/>
-                <w:noProof/>
-                <w:sz w:val="22"/>
-                <w:szCs w:val="22"/>
-                <w:lang w:val="en-GB" w:eastAsia="en-US"/>
-              </w:rPr>
-              <w:drawing>
-                <wp:anchor distT="0" distB="0" distL="114300" distR="114300" simplePos="0" relativeHeight="251665408" behindDoc="0" locked="0" layoutInCell="1" allowOverlap="1" wp14:anchorId="38D2E02F" wp14:editId="34D16A97">
-                  <wp:simplePos x="0" y="0"/>
-                  <wp:positionH relativeFrom="column">
-                    <wp:posOffset>1295689</wp:posOffset>
-                  </wp:positionH>
-                  <wp:positionV relativeFrom="page">
-                    <wp:posOffset>7731068</wp:posOffset>
-                  </wp:positionV>
-                  <wp:extent cx="1475509" cy="730885"/>
-                  <wp:effectExtent l="0" t="0" r="0" b="0"/>
-                  <wp:wrapNone/>
-                  <wp:docPr id="1719249745" name="Рисунок 2" descr="{signature}"/>
-                  <wp:cNvGraphicFramePr>
-                    <a:graphicFrameLocks xmlns:a="http://schemas.openxmlformats.org/drawingml/2006/main" noChangeAspect="1"/>
-                  </wp:cNvGraphicFramePr>
-                  <a:graphic xmlns:a="http://schemas.openxmlformats.org/drawingml/2006/main">
-                    <a:graphicData uri="http://schemas.openxmlformats.org/drawingml/2006/picture">
-                      <pic:pic xmlns:pic="http://schemas.openxmlformats.org/drawingml/2006/picture">
-                        <pic:nvPicPr>
-                          <pic:cNvPr id="1169054065" name="Рисунок 2" descr="{signature}"/>
-                          <pic:cNvPicPr/>
-                        </pic:nvPicPr>
-                        <pic:blipFill>
-                          <a:blip r:embed="rId11" cstate="print">
-                            <a:extLst>
-                              <a:ext uri="{28A0092B-C50C-407E-A947-70E740481C1C}">
-                                <a14:useLocalDpi xmlns:a14="http://schemas.microsoft.com/office/drawing/2010/main" val="0"/>
-                              </a:ext>
-                            </a:extLst>
-                          </a:blip>
-                          <a:stretch>
-                            <a:fillRect/>
-                          </a:stretch>
-                        </pic:blipFill>
-                        <pic:spPr>
-                          <a:xfrm>
-                            <a:off x="0" y="0"/>
-                            <a:ext cx="1475509" cy="730885"/>
-                          </a:xfrm>
-                          <a:prstGeom prst="rect">
-                            <a:avLst/>
-                          </a:prstGeom>
-                        </pic:spPr>
-                      </pic:pic>
-                    </a:graphicData>
-                  </a:graphic>
-                  <wp14:sizeRelH relativeFrom="page">
-                    <wp14:pctWidth>0</wp14:pctWidth>
-                  </wp14:sizeRelH>
-                  <wp14:sizeRelV relativeFrom="page">
-                    <wp14:pctHeight>0</wp14:pctHeight>
-                  </wp14:sizeRelV>
-                </wp:anchor>
-              </w:drawing>
+              <w:t>{#showSignature}</w:t>
+            </w:r>
+            <w:r>
+              <w:t>{signature}</w:t>
+            </w:r>
+            <w:r>
+              <w:t>{/showSignature}</w:t>
             </w:r>
           </w:p>
           <w:p>
@@ -7165,71 +7110,13 @@
               </w:rPr>
             </w:pPr>
             <w:r>
-              <w:rPr>
-                <w:rFonts w:asciiTheme="majorBidi" w:eastAsiaTheme="minorHAnsi" w:hAnsiTheme="majorBidi" w:cstheme="majorBidi"/>
-                <w:b/>
-                <w:bCs/>
-                <w:noProof/>
-                <w:sz w:val="22"/>
-                <w:szCs w:val="22"/>
-                <w:lang w:val="en-US" w:eastAsia="en-US"/>
-              </w:rPr>
-              <w:lastRenderedPageBreak/>
-              <w:drawing>
-                <wp:anchor distT="0" distB="0" distL="114300" distR="114300" simplePos="0" relativeHeight="251658240" behindDoc="0" locked="0" layoutInCell="1" allowOverlap="1" wp14:anchorId="6713AF97" wp14:editId="72BD3C4F">
-                  <wp:simplePos x="0" y="0"/>
-                  <wp:positionH relativeFrom="column">
-                    <wp:posOffset>259715</wp:posOffset>
-                  </wp:positionH>
-                  <wp:positionV relativeFrom="paragraph">
-                    <wp:posOffset>181610</wp:posOffset>
-                  </wp:positionV>
-                  <wp:extent cx="1882140" cy="1872615"/>
-                  <wp:effectExtent l="0" t="0" r="0" b="0"/>
-                  <wp:wrapNone/>
-                  <wp:docPr id="1692925816" name="Рисунок 1" descr="{stamp}"/>
-                  <wp:cNvGraphicFramePr>
-                    <a:graphicFrameLocks xmlns:a="http://schemas.openxmlformats.org/drawingml/2006/main" noChangeAspect="1"/>
-                  </wp:cNvGraphicFramePr>
-                  <a:graphic xmlns:a="http://schemas.openxmlformats.org/drawingml/2006/main">
-                    <a:graphicData uri="http://schemas.openxmlformats.org/drawingml/2006/picture">
-                      <pic:pic xmlns:pic="http://schemas.openxmlformats.org/drawingml/2006/picture">
-                        <pic:nvPicPr>
-                          <pic:cNvPr id="1692925816" name="Рисунок 1" descr="{stamp}"/>
-                          <pic:cNvPicPr/>
-                        </pic:nvPicPr>
-                        <pic:blipFill>
-                          <a:blip r:embed="rId12" cstate="print">
-                            <a:extLst>
-                              <a:ext uri="{28A0092B-C50C-407E-A947-70E740481C1C}">
-                                <a14:useLocalDpi xmlns:a14="http://schemas.microsoft.com/office/drawing/2010/main" val="0"/>
-                              </a:ext>
-                            </a:extLst>
-                          </a:blip>
-                          <a:stretch>
-                            <a:fillRect/>
-                          </a:stretch>
-                        </pic:blipFill>
-                        <pic:spPr>
-                          <a:xfrm>
-                            <a:off x="0" y="0"/>
-                            <a:ext cx="1882140" cy="1872615"/>
-                          </a:xfrm>
-                          <a:prstGeom prst="rect">
-                            <a:avLst/>
-                          </a:prstGeom>
-                        </pic:spPr>
-                      </pic:pic>
-                    </a:graphicData>
-                  </a:graphic>
-                  <wp14:sizeRelH relativeFrom="margin">
-                    <wp14:pctWidth>0</wp14:pctWidth>
-                  </wp14:sizeRelH>
-                  <wp14:sizeRelV relativeFrom="margin">
-                    <wp14:pctHeight>0</wp14:pctHeight>
-                  </wp14:sizeRelV>
-                </wp:anchor>
-              </w:drawing>
+              <w:t>{#showStamp}</w:t>
+            </w:r>
+            <w:r>
+              <w:t>{stamp}</w:t>
+            </w:r>
+            <w:r>
+              <w:t>{/showStamp}</w:t>
             </w:r>
           </w:p>
           <w:p>
@@ -8522,68 +8409,13 @@
               </w:rPr>
             </w:pPr>
             <w:r>
-              <w:rPr>
-                <w:rFonts w:asciiTheme="majorBidi" w:eastAsiaTheme="minorHAnsi" w:hAnsiTheme="majorBidi" w:cstheme="majorBidi"/>
-                <w:noProof/>
-                <w:sz w:val="22"/>
-                <w:szCs w:val="22"/>
-                <w:lang w:val="en-GB" w:eastAsia="en-US"/>
-              </w:rPr>
-              <w:drawing>
-                <wp:anchor distT="0" distB="0" distL="114300" distR="114300" simplePos="0" relativeHeight="251663360" behindDoc="0" locked="0" layoutInCell="1" allowOverlap="1" wp14:anchorId="64C67676" wp14:editId="74659022">
-                  <wp:simplePos x="0" y="0"/>
-                  <wp:positionH relativeFrom="column">
-                    <wp:posOffset>1488959</wp:posOffset>
-                  </wp:positionH>
-                  <wp:positionV relativeFrom="page">
-                    <wp:posOffset>7802822</wp:posOffset>
-                  </wp:positionV>
-                  <wp:extent cx="1475509" cy="730885"/>
-                  <wp:effectExtent l="0" t="0" r="0" b="0"/>
-                  <wp:wrapNone/>
-                  <wp:docPr id="1977485429" name="Рисунок 2" descr="{signature}"/>
-                  <wp:cNvGraphicFramePr>
-                    <a:graphicFrameLocks xmlns:a="http://schemas.openxmlformats.org/drawingml/2006/main" noChangeAspect="1"/>
-                  </wp:cNvGraphicFramePr>
-                  <a:graphic xmlns:a="http://schemas.openxmlformats.org/drawingml/2006/main">
-                    <a:graphicData uri="http://schemas.openxmlformats.org/drawingml/2006/picture">
-                      <pic:pic xmlns:pic="http://schemas.openxmlformats.org/drawingml/2006/picture">
-                        <pic:nvPicPr>
-                          <pic:cNvPr id="1169054065" name="Рисунок 2" descr="{signature}"/>
-                          <pic:cNvPicPr/>
-                        </pic:nvPicPr>
-                        <pic:blipFill>
-                          <a:blip r:embed="rId11" cstate="print">
-                            <a:extLst>
-                              <a:ext uri="{28A0092B-C50C-407E-A947-70E740481C1C}">
-                                <a14:useLocalDpi xmlns:a14="http://schemas.microsoft.com/office/drawing/2010/main" val="0"/>
-                              </a:ext>
-                            </a:extLst>
-                          </a:blip>
-                          <a:stretch>
-                            <a:fillRect/>
-                          </a:stretch>
-                        </pic:blipFill>
-                        <pic:spPr>
-                          <a:xfrm>
-                            <a:off x="0" y="0"/>
-                            <a:ext cx="1479161" cy="732694"/>
-                          </a:xfrm>
-                          <a:prstGeom prst="rect">
-                            <a:avLst/>
-                          </a:prstGeom>
-                        </pic:spPr>
-                      </pic:pic>
-                    </a:graphicData>
-                  </a:graphic>
-                  <wp14:sizeRelH relativeFrom="page">
-                    <wp14:pctWidth>0</wp14:pctWidth>
-                  </wp14:sizeRelH>
-                  <wp14:sizeRelV relativeFrom="page">
-                    <wp14:pctHeight>0</wp14:pctHeight>
-                  </wp14:sizeRelV>
-                </wp:anchor>
-              </w:drawing>
+              <w:t>{#showSignature}</w:t>
+            </w:r>
+            <w:r>
+              <w:t>{signature}</w:t>
+            </w:r>
+            <w:r>
+              <w:t>{/showSignature}</w:t>
             </w:r>
           </w:p>
           <w:p>
@@ -8684,71 +8516,13 @@
               </w:rPr>
             </w:pPr>
             <w:r>
-              <w:rPr>
-                <w:rFonts w:asciiTheme="majorBidi" w:eastAsiaTheme="minorHAnsi" w:hAnsiTheme="majorBidi" w:cstheme="majorBidi"/>
-                <w:b/>
-                <w:bCs/>
-                <w:noProof/>
-                <w:sz w:val="22"/>
-                <w:szCs w:val="22"/>
-                <w:lang w:val="en-US" w:eastAsia="en-US"/>
-              </w:rPr>
-              <w:lastRenderedPageBreak/>
-              <w:drawing>
-                <wp:anchor distT="0" distB="0" distL="114300" distR="114300" simplePos="0" relativeHeight="251660288" behindDoc="0" locked="0" layoutInCell="1" allowOverlap="1" wp14:anchorId="25E1A022" wp14:editId="42A653D9">
-                  <wp:simplePos x="0" y="0"/>
-                  <wp:positionH relativeFrom="column">
-                    <wp:posOffset>879625</wp:posOffset>
-                  </wp:positionH>
-                  <wp:positionV relativeFrom="paragraph">
-                    <wp:posOffset>181647</wp:posOffset>
-                  </wp:positionV>
-                  <wp:extent cx="1882140" cy="1872615"/>
-                  <wp:effectExtent l="0" t="0" r="0" b="0"/>
-                  <wp:wrapNone/>
-                  <wp:docPr id="2087212993" name="Рисунок 1" descr="{stamp}"/>
-                  <wp:cNvGraphicFramePr>
-                    <a:graphicFrameLocks xmlns:a="http://schemas.openxmlformats.org/drawingml/2006/main" noChangeAspect="1"/>
-                  </wp:cNvGraphicFramePr>
-                  <a:graphic xmlns:a="http://schemas.openxmlformats.org/drawingml/2006/main">
-                    <a:graphicData uri="http://schemas.openxmlformats.org/drawingml/2006/picture">
-                      <pic:pic xmlns:pic="http://schemas.openxmlformats.org/drawingml/2006/picture">
-                        <pic:nvPicPr>
-                          <pic:cNvPr id="2087212993" name="Рисунок 1" descr="{stamp}"/>
-                          <pic:cNvPicPr/>
-                        </pic:nvPicPr>
-                        <pic:blipFill>
-                          <a:blip r:embed="rId12" cstate="print">
-                            <a:extLst>
-                              <a:ext uri="{28A0092B-C50C-407E-A947-70E740481C1C}">
-                                <a14:useLocalDpi xmlns:a14="http://schemas.microsoft.com/office/drawing/2010/main" val="0"/>
-                              </a:ext>
-                            </a:extLst>
-                          </a:blip>
-                          <a:stretch>
-                            <a:fillRect/>
-                          </a:stretch>
-                        </pic:blipFill>
-                        <pic:spPr>
-                          <a:xfrm rot="224421">
-                            <a:off x="0" y="0"/>
-                            <a:ext cx="1882140" cy="1872615"/>
-                          </a:xfrm>
-                          <a:prstGeom prst="rect">
-                            <a:avLst/>
-                          </a:prstGeom>
-                        </pic:spPr>
-                      </pic:pic>
-                    </a:graphicData>
-                  </a:graphic>
-                  <wp14:sizeRelH relativeFrom="margin">
-                    <wp14:pctWidth>0</wp14:pctWidth>
-                  </wp14:sizeRelH>
-                  <wp14:sizeRelV relativeFrom="margin">
-                    <wp14:pctHeight>0</wp14:pctHeight>
-                  </wp14:sizeRelV>
-                </wp:anchor>
-              </w:drawing>
+              <w:t>{#showStamp}</w:t>
+            </w:r>
+            <w:r>
+              <w:t>{stamp}</w:t>
+            </w:r>
+            <w:r>
+              <w:t>{/showStamp}</w:t>
             </w:r>
           </w:p>
           <w:p>

</xml_diff>